<commit_message>
seo: on-page SEO, favicon, sitemap/robots, RuStore listing + GTM SEO layer
- landing <head>: keyword title/description (трекер сна / экранное время),
  canonical, keywords, JSON-LD SoftwareApplication, favicon (app-icon style),
  Яндекс.Метрика placeholder; hero-sub reworded for keywords
- web/favicon.svg, robots.txt, sitemap.xml
- docs/rustore-listing.md — store copy tuned to real search demand
- GTM doc: added SEO/discovery section (RuStore-first, custom domain, keywords)
</commit_message>
<xml_diff>
--- a/docs/GTM-stage2.docx
+++ b/docs/GTM-stage2.docx
@@ -1200,6 +1200,99 @@
           <w:szCs w:val="22"/>
         </w:rPr>
         <w:t xml:space="preserve">Стадия 2 (с бюджетом): лить в те же fit-пулы + lookalike + микро-инфлюенсеры, никакого слепого широкого охвата. Оружие ранжирования — сильный ретеншн (D7 76% на тёплых) + глубина вовлечённости (Calls/DAU).</w:t>
+      </w:r>
+    </w:p>
+    <w:p>
+      <w:pPr>
+        <w:pStyle w:val="Heading1"/>
+        <w:spacing w:after="90" w:before="220"/>
+      </w:pPr>
+      <w:r>
+        <w:t xml:space="preserve">SEO и органический поиск</w:t>
+      </w:r>
+    </w:p>
+    <w:p>
+      <w:pPr>
+        <w:spacing w:after="60"/>
+      </w:pPr>
+      <w:r>
+        <w:rPr>
+          <w:b w:val="false"/>
+          <w:bCs w:val="false"/>
+          <w:i w:val="false"/>
+          <w:iCs w:val="false"/>
+          <w:sz w:val="22"/>
+          <w:szCs w:val="22"/>
+        </w:rPr>
+        <w:t xml:space="preserve">По итогам SEO-аудита (keys.so): эмоциональные формулировки спроса почти не ищут — спрос лежит в смежных запросах. Органику строим под них.</w:t>
+      </w:r>
+    </w:p>
+    <w:p>
+      <w:pPr>
+        <w:pStyle w:val="ListParagraph"/>
+        <w:numPr>
+          <w:ilvl w:val="0"/>
+          <w:numId w:val="2"/>
+        </w:numPr>
+        <w:spacing w:after="60"/>
+      </w:pPr>
+      <w:r>
+        <w:rPr>
+          <w:sz w:val="22"/>
+          <w:szCs w:val="22"/>
+        </w:rPr>
+        <w:t xml:space="preserve">RuStore-листинг — ход №1 по видимости: rustore.ru в топ-10 Google по 51 из 72 запросов, то есть карточка даёт показы раньше, чем проиндексируется сайт. Конкуренты (Welltory, StayFree, Daylio) в РФ-поиске почти не видны — окно открыто.</w:t>
+      </w:r>
+    </w:p>
+    <w:p>
+      <w:pPr>
+        <w:pStyle w:val="ListParagraph"/>
+        <w:numPr>
+          <w:ilvl w:val="0"/>
+          <w:numId w:val="2"/>
+        </w:numPr>
+        <w:spacing w:after="60"/>
+      </w:pPr>
+      <w:r>
+        <w:rPr>
+          <w:sz w:val="22"/>
+          <w:szCs w:val="22"/>
+        </w:rPr>
+        <w:t xml:space="preserve">Кастомный домен для лендинга — разблокирует индексацию: на github.io нельзя положить robots.txt / sitemap в корень домена, поэтому сайт сейчас не в индексе.</w:t>
+      </w:r>
+    </w:p>
+    <w:p>
+      <w:pPr>
+        <w:pStyle w:val="ListParagraph"/>
+        <w:numPr>
+          <w:ilvl w:val="0"/>
+          <w:numId w:val="2"/>
+        </w:numPr>
+        <w:spacing w:after="60"/>
+      </w:pPr>
+      <w:r>
+        <w:rPr>
+          <w:sz w:val="22"/>
+          <w:szCs w:val="22"/>
+        </w:rPr>
+        <w:t xml:space="preserve">Ключи-мишени: «трекер сна» (1836), «как посмотреть экранное время на андроиде» (1550), «экранное время» (1303), «цифровое благополучие». Title и описания лендинга и RuStore затачиваются под них; эмо-хук («почему вчера был тяжёлый день») остаётся для креативов и первых строк карточки.</w:t>
+      </w:r>
+    </w:p>
+    <w:p>
+      <w:pPr>
+        <w:pStyle w:val="ListParagraph"/>
+        <w:numPr>
+          <w:ilvl w:val="0"/>
+          <w:numId w:val="2"/>
+        </w:numPr>
+        <w:spacing w:after="60"/>
+      </w:pPr>
+      <w:r>
+        <w:rPr>
+          <w:sz w:val="22"/>
+          <w:szCs w:val="22"/>
+        </w:rPr>
+        <w:t xml:space="preserve">On-page (сделано на лендинге): JSON-LD SoftwareApplication, sitemap.xml, robots.txt, canonical, favicon, keyword-title; задел под Яндекс.Метрику.</w:t>
       </w:r>
     </w:p>
     <w:sectPr>

</xml_diff>

<commit_message>
docs/gtm: add starter list of 6 fit Telegram channels
</commit_message>
<xml_diff>
--- a/docs/GTM-stage2.docx
+++ b/docs/GTM-stage2.docx
@@ -939,6 +939,787 @@
                 <w:szCs w:val="20"/>
               </w:rPr>
               <w:t xml:space="preserve">D7 от инфлюенсера &lt; ≈40% или CPI не окупается качеством</w:t>
+            </w:r>
+          </w:p>
+        </w:tc>
+      </w:tr>
+    </w:tbl>
+    <w:p>
+      <w:pPr>
+        <w:spacing w:after="60"/>
+      </w:pPr>
+      <w:r>
+        <w:rPr>
+          <w:b w:val="false"/>
+          <w:bCs w:val="false"/>
+          <w:i w:val="false"/>
+          <w:iCs w:val="false"/>
+          <w:sz w:val="22"/>
+          <w:szCs w:val="22"/>
+        </w:rPr>
+        <w:t xml:space="preserve"/>
+      </w:r>
+    </w:p>
+    <w:p>
+      <w:pPr>
+        <w:pStyle w:val="Heading1"/>
+        <w:spacing w:after="90" w:before="220"/>
+      </w:pPr>
+      <w:r>
+        <w:t xml:space="preserve">Стартовый список каналов (Telegram)</w:t>
+      </w:r>
+    </w:p>
+    <w:p>
+      <w:pPr>
+        <w:spacing w:after="90"/>
+      </w:pPr>
+      <w:r>
+        <w:rPr>
+          <w:b w:val="false"/>
+          <w:bCs w:val="false"/>
+          <w:i w:val="false"/>
+          <w:iCs w:val="false"/>
+          <w:sz w:val="22"/>
+          <w:szCs w:val="22"/>
+        </w:rPr>
+        <w:t xml:space="preserve">Реальные нишевые каналы под наш фит (трекинг / биохакинг / сон / цифровое благополучие), собраны через публичные каталоги. Цифры приблизительные — перед закупкой сверять актуальные подписчики и ERR/охват в TGStat; критерий отбора — вовлечённость и фит, а не размер.</w:t>
+      </w:r>
+    </w:p>
+    <w:tbl>
+      <w:tblPr>
+        <w:tblW w:type="dxa" w:w="9000"/>
+        <w:tblBorders>
+          <w:top w:val="single" w:color="auto" w:sz="4"/>
+          <w:left w:val="single" w:color="auto" w:sz="4"/>
+          <w:bottom w:val="single" w:color="auto" w:sz="4"/>
+          <w:right w:val="single" w:color="auto" w:sz="4"/>
+          <w:insideH w:val="single" w:color="auto" w:sz="4"/>
+          <w:insideV w:val="single" w:color="auto" w:sz="4"/>
+        </w:tblBorders>
+      </w:tblPr>
+      <w:tblGrid>
+        <w:gridCol w:w="2700"/>
+        <w:gridCol w:w="1100"/>
+        <w:gridCol w:w="1300"/>
+        <w:gridCol w:w="3900"/>
+      </w:tblGrid>
+      <w:tr>
+        <w:trPr>
+          <w:tblHeader/>
+        </w:trPr>
+        <w:tc>
+          <w:tcPr>
+            <w:tcW w:type="dxa" w:w="2700"/>
+            <w:shd w:fill="EEEEEE" w:val="clear"/>
+            <w:tcMar>
+              <w:top w:type="dxa" w:w="60"/>
+              <w:left w:type="dxa" w:w="90"/>
+              <w:bottom w:type="dxa" w:w="60"/>
+              <w:right w:type="dxa" w:w="90"/>
+            </w:tcMar>
+          </w:tcPr>
+          <w:p>
+            <w:pPr>
+              <w:spacing w:after="0"/>
+            </w:pPr>
+            <w:r>
+              <w:rPr>
+                <w:b/>
+                <w:bCs/>
+                <w:sz w:val="20"/>
+                <w:szCs w:val="20"/>
+              </w:rPr>
+              <w:t xml:space="preserve">Канал (@хэндл)</w:t>
+            </w:r>
+          </w:p>
+        </w:tc>
+        <w:tc>
+          <w:tcPr>
+            <w:tcW w:type="dxa" w:w="1100"/>
+            <w:shd w:fill="EEEEEE" w:val="clear"/>
+            <w:tcMar>
+              <w:top w:type="dxa" w:w="60"/>
+              <w:left w:type="dxa" w:w="90"/>
+              <w:bottom w:type="dxa" w:w="60"/>
+              <w:right w:type="dxa" w:w="90"/>
+            </w:tcMar>
+          </w:tcPr>
+          <w:p>
+            <w:pPr>
+              <w:spacing w:after="0"/>
+            </w:pPr>
+            <w:r>
+              <w:rPr>
+                <w:b/>
+                <w:bCs/>
+                <w:sz w:val="20"/>
+                <w:szCs w:val="20"/>
+              </w:rPr>
+              <w:t xml:space="preserve">Подписчики</w:t>
+            </w:r>
+          </w:p>
+        </w:tc>
+        <w:tc>
+          <w:tcPr>
+            <w:tcW w:type="dxa" w:w="1300"/>
+            <w:shd w:fill="EEEEEE" w:val="clear"/>
+            <w:tcMar>
+              <w:top w:type="dxa" w:w="60"/>
+              <w:left w:type="dxa" w:w="90"/>
+              <w:bottom w:type="dxa" w:w="60"/>
+              <w:right w:type="dxa" w:w="90"/>
+            </w:tcMar>
+          </w:tcPr>
+          <w:p>
+            <w:pPr>
+              <w:spacing w:after="0"/>
+            </w:pPr>
+            <w:r>
+              <w:rPr>
+                <w:b/>
+                <w:bCs/>
+                <w:sz w:val="20"/>
+                <w:szCs w:val="20"/>
+              </w:rPr>
+              <w:t xml:space="preserve">Фит</w:t>
+            </w:r>
+          </w:p>
+        </w:tc>
+        <w:tc>
+          <w:tcPr>
+            <w:tcW w:type="dxa" w:w="3900"/>
+            <w:shd w:fill="EEEEEE" w:val="clear"/>
+            <w:tcMar>
+              <w:top w:type="dxa" w:w="60"/>
+              <w:left w:type="dxa" w:w="90"/>
+              <w:bottom w:type="dxa" w:w="60"/>
+              <w:right w:type="dxa" w:w="90"/>
+            </w:tcMar>
+          </w:tcPr>
+          <w:p>
+            <w:pPr>
+              <w:spacing w:after="0"/>
+            </w:pPr>
+            <w:r>
+              <w:rPr>
+                <w:b/>
+                <w:bCs/>
+                <w:sz w:val="20"/>
+                <w:szCs w:val="20"/>
+              </w:rPr>
+              <w:t xml:space="preserve">Почему / примечание</w:t>
+            </w:r>
+          </w:p>
+        </w:tc>
+      </w:tr>
+      <w:tr>
+        <w:tc>
+          <w:tcPr>
+            <w:tcW w:type="dxa" w:w="2700"/>
+            <w:tcMar>
+              <w:top w:type="dxa" w:w="60"/>
+              <w:left w:type="dxa" w:w="90"/>
+              <w:bottom w:type="dxa" w:w="60"/>
+              <w:right w:type="dxa" w:w="90"/>
+            </w:tcMar>
+          </w:tcPr>
+          <w:p>
+            <w:pPr>
+              <w:spacing w:after="0"/>
+            </w:pPr>
+            <w:r>
+              <w:rPr>
+                <w:b w:val="false"/>
+                <w:bCs w:val="false"/>
+                <w:sz w:val="20"/>
+                <w:szCs w:val="20"/>
+              </w:rPr>
+              <w:t xml:space="preserve">Что-то на нейронаучном (@polina_krivykh)</w:t>
+            </w:r>
+          </w:p>
+        </w:tc>
+        <w:tc>
+          <w:tcPr>
+            <w:tcW w:type="dxa" w:w="1100"/>
+            <w:tcMar>
+              <w:top w:type="dxa" w:w="60"/>
+              <w:left w:type="dxa" w:w="90"/>
+              <w:bottom w:type="dxa" w:w="60"/>
+              <w:right w:type="dxa" w:w="90"/>
+            </w:tcMar>
+          </w:tcPr>
+          <w:p>
+            <w:pPr>
+              <w:spacing w:after="0"/>
+            </w:pPr>
+            <w:r>
+              <w:rPr>
+                <w:b w:val="false"/>
+                <w:bCs w:val="false"/>
+                <w:sz w:val="20"/>
+                <w:szCs w:val="20"/>
+              </w:rPr>
+              <w:t xml:space="preserve">н/д</w:t>
+            </w:r>
+          </w:p>
+        </w:tc>
+        <w:tc>
+          <w:tcPr>
+            <w:tcW w:type="dxa" w:w="1300"/>
+            <w:tcMar>
+              <w:top w:type="dxa" w:w="60"/>
+              <w:left w:type="dxa" w:w="90"/>
+              <w:bottom w:type="dxa" w:w="60"/>
+              <w:right w:type="dxa" w:w="90"/>
+            </w:tcMar>
+          </w:tcPr>
+          <w:p>
+            <w:pPr>
+              <w:spacing w:after="0"/>
+            </w:pPr>
+            <w:r>
+              <w:rPr>
+                <w:b w:val="false"/>
+                <w:bCs w:val="false"/>
+                <w:sz w:val="20"/>
+                <w:szCs w:val="20"/>
+              </w:rPr>
+              <w:t xml:space="preserve">высокий</w:t>
+            </w:r>
+          </w:p>
+        </w:tc>
+        <w:tc>
+          <w:tcPr>
+            <w:tcW w:type="dxa" w:w="3900"/>
+            <w:tcMar>
+              <w:top w:type="dxa" w:w="60"/>
+              <w:left w:type="dxa" w:w="90"/>
+              <w:bottom w:type="dxa" w:w="60"/>
+              <w:right w:type="dxa" w:w="90"/>
+            </w:tcMar>
+          </w:tcPr>
+          <w:p>
+            <w:pPr>
+              <w:spacing w:after="0"/>
+            </w:pPr>
+            <w:r>
+              <w:rPr>
+                <w:b w:val="false"/>
+                <w:bCs w:val="false"/>
+                <w:sz w:val="20"/>
+                <w:szCs w:val="20"/>
+              </w:rPr>
+              <w:t xml:space="preserve">Психофизиолог, разбирает данные фитнес-трекеров и приложений — наша ЦА и тон наблюдателя. Бесплатный заход (показать разбор дня, взаимность).</w:t>
+            </w:r>
+          </w:p>
+        </w:tc>
+      </w:tr>
+      <w:tr>
+        <w:tc>
+          <w:tcPr>
+            <w:tcW w:type="dxa" w:w="2700"/>
+            <w:tcMar>
+              <w:top w:type="dxa" w:w="60"/>
+              <w:left w:type="dxa" w:w="90"/>
+              <w:bottom w:type="dxa" w:w="60"/>
+              <w:right w:type="dxa" w:w="90"/>
+            </w:tcMar>
+          </w:tcPr>
+          <w:p>
+            <w:pPr>
+              <w:spacing w:after="0"/>
+            </w:pPr>
+            <w:r>
+              <w:rPr>
+                <w:b w:val="false"/>
+                <w:bCs w:val="false"/>
+                <w:sz w:val="20"/>
+                <w:szCs w:val="20"/>
+              </w:rPr>
+              <w:t xml:space="preserve">Ноотропы и Биохакинг | RISE (@mind_rise)</w:t>
+            </w:r>
+          </w:p>
+        </w:tc>
+        <w:tc>
+          <w:tcPr>
+            <w:tcW w:type="dxa" w:w="1100"/>
+            <w:tcMar>
+              <w:top w:type="dxa" w:w="60"/>
+              <w:left w:type="dxa" w:w="90"/>
+              <w:bottom w:type="dxa" w:w="60"/>
+              <w:right w:type="dxa" w:w="90"/>
+            </w:tcMar>
+          </w:tcPr>
+          <w:p>
+            <w:pPr>
+              <w:spacing w:after="0"/>
+            </w:pPr>
+            <w:r>
+              <w:rPr>
+                <w:b w:val="false"/>
+                <w:bCs w:val="false"/>
+                <w:sz w:val="20"/>
+                <w:szCs w:val="20"/>
+              </w:rPr>
+              <w:t xml:space="preserve">≈39k</w:t>
+            </w:r>
+          </w:p>
+        </w:tc>
+        <w:tc>
+          <w:tcPr>
+            <w:tcW w:type="dxa" w:w="1300"/>
+            <w:tcMar>
+              <w:top w:type="dxa" w:w="60"/>
+              <w:left w:type="dxa" w:w="90"/>
+              <w:bottom w:type="dxa" w:w="60"/>
+              <w:right w:type="dxa" w:w="90"/>
+            </w:tcMar>
+          </w:tcPr>
+          <w:p>
+            <w:pPr>
+              <w:spacing w:after="0"/>
+            </w:pPr>
+            <w:r>
+              <w:rPr>
+                <w:b w:val="false"/>
+                <w:bCs w:val="false"/>
+                <w:sz w:val="20"/>
+                <w:szCs w:val="20"/>
+              </w:rPr>
+              <w:t xml:space="preserve">высокий</w:t>
+            </w:r>
+          </w:p>
+        </w:tc>
+        <w:tc>
+          <w:tcPr>
+            <w:tcW w:type="dxa" w:w="3900"/>
+            <w:tcMar>
+              <w:top w:type="dxa" w:w="60"/>
+              <w:left w:type="dxa" w:w="90"/>
+              <w:bottom w:type="dxa" w:w="60"/>
+              <w:right w:type="dxa" w:w="90"/>
+            </w:tcMar>
+          </w:tcPr>
+          <w:p>
+            <w:pPr>
+              <w:spacing w:after="0"/>
+            </w:pPr>
+            <w:r>
+              <w:rPr>
+                <w:b w:val="false"/>
+                <w:bCs w:val="false"/>
+                <w:sz w:val="20"/>
+                <w:szCs w:val="20"/>
+              </w:rPr>
+              <w:t xml:space="preserve">Биохакинг + обзоры браслетов + трекеры сна. Очень рекламный — только платная интеграция.</w:t>
+            </w:r>
+          </w:p>
+        </w:tc>
+      </w:tr>
+      <w:tr>
+        <w:tc>
+          <w:tcPr>
+            <w:tcW w:type="dxa" w:w="2700"/>
+            <w:tcMar>
+              <w:top w:type="dxa" w:w="60"/>
+              <w:left w:type="dxa" w:w="90"/>
+              <w:bottom w:type="dxa" w:w="60"/>
+              <w:right w:type="dxa" w:w="90"/>
+            </w:tcMar>
+          </w:tcPr>
+          <w:p>
+            <w:pPr>
+              <w:spacing w:after="0"/>
+            </w:pPr>
+            <w:r>
+              <w:rPr>
+                <w:b w:val="false"/>
+                <w:bCs w:val="false"/>
+                <w:sz w:val="20"/>
+                <w:szCs w:val="20"/>
+              </w:rPr>
+              <w:t xml:space="preserve">Биохакинг и ноотропы (@andreyarbenin)</w:t>
+            </w:r>
+          </w:p>
+        </w:tc>
+        <w:tc>
+          <w:tcPr>
+            <w:tcW w:type="dxa" w:w="1100"/>
+            <w:tcMar>
+              <w:top w:type="dxa" w:w="60"/>
+              <w:left w:type="dxa" w:w="90"/>
+              <w:bottom w:type="dxa" w:w="60"/>
+              <w:right w:type="dxa" w:w="90"/>
+            </w:tcMar>
+          </w:tcPr>
+          <w:p>
+            <w:pPr>
+              <w:spacing w:after="0"/>
+            </w:pPr>
+            <w:r>
+              <w:rPr>
+                <w:b w:val="false"/>
+                <w:bCs w:val="false"/>
+                <w:sz w:val="20"/>
+                <w:szCs w:val="20"/>
+              </w:rPr>
+              <w:t xml:space="preserve">≈24.7k</w:t>
+            </w:r>
+          </w:p>
+        </w:tc>
+        <w:tc>
+          <w:tcPr>
+            <w:tcW w:type="dxa" w:w="1300"/>
+            <w:tcMar>
+              <w:top w:type="dxa" w:w="60"/>
+              <w:left w:type="dxa" w:w="90"/>
+              <w:bottom w:type="dxa" w:w="60"/>
+              <w:right w:type="dxa" w:w="90"/>
+            </w:tcMar>
+          </w:tcPr>
+          <w:p>
+            <w:pPr>
+              <w:spacing w:after="0"/>
+            </w:pPr>
+            <w:r>
+              <w:rPr>
+                <w:b w:val="false"/>
+                <w:bCs w:val="false"/>
+                <w:sz w:val="20"/>
+                <w:szCs w:val="20"/>
+              </w:rPr>
+              <w:t xml:space="preserve">средний-высокий</w:t>
+            </w:r>
+          </w:p>
+        </w:tc>
+        <w:tc>
+          <w:tcPr>
+            <w:tcW w:type="dxa" w:w="3900"/>
+            <w:tcMar>
+              <w:top w:type="dxa" w:w="60"/>
+              <w:left w:type="dxa" w:w="90"/>
+              <w:bottom w:type="dxa" w:w="60"/>
+              <w:right w:type="dxa" w:w="90"/>
+            </w:tcMar>
+          </w:tcPr>
+          <w:p>
+            <w:pPr>
+              <w:spacing w:after="0"/>
+            </w:pPr>
+            <w:r>
+              <w:rPr>
+                <w:b w:val="false"/>
+                <w:bCs w:val="false"/>
+                <w:sz w:val="20"/>
+                <w:szCs w:val="20"/>
+              </w:rPr>
+              <w:t xml:space="preserve">Крупный биохакинг-канал в целевом диапазоне 5–50k.</w:t>
+            </w:r>
+          </w:p>
+        </w:tc>
+      </w:tr>
+      <w:tr>
+        <w:tc>
+          <w:tcPr>
+            <w:tcW w:type="dxa" w:w="2700"/>
+            <w:tcMar>
+              <w:top w:type="dxa" w:w="60"/>
+              <w:left w:type="dxa" w:w="90"/>
+              <w:bottom w:type="dxa" w:w="60"/>
+              <w:right w:type="dxa" w:w="90"/>
+            </w:tcMar>
+          </w:tcPr>
+          <w:p>
+            <w:pPr>
+              <w:spacing w:after="0"/>
+            </w:pPr>
+            <w:r>
+              <w:rPr>
+                <w:b w:val="false"/>
+                <w:bCs w:val="false"/>
+                <w:sz w:val="20"/>
+                <w:szCs w:val="20"/>
+              </w:rPr>
+              <w:t xml:space="preserve">RED PILL (@redpillnootrop)</w:t>
+            </w:r>
+          </w:p>
+        </w:tc>
+        <w:tc>
+          <w:tcPr>
+            <w:tcW w:type="dxa" w:w="1100"/>
+            <w:tcMar>
+              <w:top w:type="dxa" w:w="60"/>
+              <w:left w:type="dxa" w:w="90"/>
+              <w:bottom w:type="dxa" w:w="60"/>
+              <w:right w:type="dxa" w:w="90"/>
+            </w:tcMar>
+          </w:tcPr>
+          <w:p>
+            <w:pPr>
+              <w:spacing w:after="0"/>
+            </w:pPr>
+            <w:r>
+              <w:rPr>
+                <w:b w:val="false"/>
+                <w:bCs w:val="false"/>
+                <w:sz w:val="20"/>
+                <w:szCs w:val="20"/>
+              </w:rPr>
+              <w:t xml:space="preserve">≈3.8k</w:t>
+            </w:r>
+          </w:p>
+        </w:tc>
+        <w:tc>
+          <w:tcPr>
+            <w:tcW w:type="dxa" w:w="1300"/>
+            <w:tcMar>
+              <w:top w:type="dxa" w:w="60"/>
+              <w:left w:type="dxa" w:w="90"/>
+              <w:bottom w:type="dxa" w:w="60"/>
+              <w:right w:type="dxa" w:w="90"/>
+            </w:tcMar>
+          </w:tcPr>
+          <w:p>
+            <w:pPr>
+              <w:spacing w:after="0"/>
+            </w:pPr>
+            <w:r>
+              <w:rPr>
+                <w:b w:val="false"/>
+                <w:bCs w:val="false"/>
+                <w:sz w:val="20"/>
+                <w:szCs w:val="20"/>
+              </w:rPr>
+              <w:t xml:space="preserve">хороший (микро)</w:t>
+            </w:r>
+          </w:p>
+        </w:tc>
+        <w:tc>
+          <w:tcPr>
+            <w:tcW w:type="dxa" w:w="3900"/>
+            <w:tcMar>
+              <w:top w:type="dxa" w:w="60"/>
+              <w:left w:type="dxa" w:w="90"/>
+              <w:bottom w:type="dxa" w:w="60"/>
+              <w:right w:type="dxa" w:w="90"/>
+            </w:tcMar>
+          </w:tcPr>
+          <w:p>
+            <w:pPr>
+              <w:spacing w:after="0"/>
+            </w:pPr>
+            <w:r>
+              <w:rPr>
+                <w:b w:val="false"/>
+                <w:bCs w:val="false"/>
+                <w:sz w:val="20"/>
+                <w:szCs w:val="20"/>
+              </w:rPr>
+              <w:t xml:space="preserve">Пишет про трекеры сна (Sleep as Android, SleepCycle) — узкая тёплая аудитория, дешёвый тест.</w:t>
+            </w:r>
+          </w:p>
+        </w:tc>
+      </w:tr>
+      <w:tr>
+        <w:tc>
+          <w:tcPr>
+            <w:tcW w:type="dxa" w:w="2700"/>
+            <w:tcMar>
+              <w:top w:type="dxa" w:w="60"/>
+              <w:left w:type="dxa" w:w="90"/>
+              <w:bottom w:type="dxa" w:w="60"/>
+              <w:right w:type="dxa" w:w="90"/>
+            </w:tcMar>
+          </w:tcPr>
+          <w:p>
+            <w:pPr>
+              <w:spacing w:after="0"/>
+            </w:pPr>
+            <w:r>
+              <w:rPr>
+                <w:b w:val="false"/>
+                <w:bCs w:val="false"/>
+                <w:sz w:val="20"/>
+                <w:szCs w:val="20"/>
+              </w:rPr>
+              <w:t xml:space="preserve">Digital благополучие (@digital_well)</w:t>
+            </w:r>
+          </w:p>
+        </w:tc>
+        <w:tc>
+          <w:tcPr>
+            <w:tcW w:type="dxa" w:w="1100"/>
+            <w:tcMar>
+              <w:top w:type="dxa" w:w="60"/>
+              <w:left w:type="dxa" w:w="90"/>
+              <w:bottom w:type="dxa" w:w="60"/>
+              <w:right w:type="dxa" w:w="90"/>
+            </w:tcMar>
+          </w:tcPr>
+          <w:p>
+            <w:pPr>
+              <w:spacing w:after="0"/>
+            </w:pPr>
+            <w:r>
+              <w:rPr>
+                <w:b w:val="false"/>
+                <w:bCs w:val="false"/>
+                <w:sz w:val="20"/>
+                <w:szCs w:val="20"/>
+              </w:rPr>
+              <w:t xml:space="preserve">≈3.3k</w:t>
+            </w:r>
+          </w:p>
+        </w:tc>
+        <w:tc>
+          <w:tcPr>
+            <w:tcW w:type="dxa" w:w="1300"/>
+            <w:tcMar>
+              <w:top w:type="dxa" w:w="60"/>
+              <w:left w:type="dxa" w:w="90"/>
+              <w:bottom w:type="dxa" w:w="60"/>
+              <w:right w:type="dxa" w:w="90"/>
+            </w:tcMar>
+          </w:tcPr>
+          <w:p>
+            <w:pPr>
+              <w:spacing w:after="0"/>
+            </w:pPr>
+            <w:r>
+              <w:rPr>
+                <w:b w:val="false"/>
+                <w:bCs w:val="false"/>
+                <w:sz w:val="20"/>
+                <w:szCs w:val="20"/>
+              </w:rPr>
+              <w:t xml:space="preserve">высокий</w:t>
+            </w:r>
+          </w:p>
+        </w:tc>
+        <w:tc>
+          <w:tcPr>
+            <w:tcW w:type="dxa" w:w="3900"/>
+            <w:tcMar>
+              <w:top w:type="dxa" w:w="60"/>
+              <w:left w:type="dxa" w:w="90"/>
+              <w:bottom w:type="dxa" w:w="60"/>
+              <w:right w:type="dxa" w:w="90"/>
+            </w:tcMar>
+          </w:tcPr>
+          <w:p>
+            <w:pPr>
+              <w:spacing w:after="0"/>
+            </w:pPr>
+            <w:r>
+              <w:rPr>
+                <w:b w:val="false"/>
+                <w:bCs w:val="false"/>
+                <w:sz w:val="20"/>
+                <w:szCs w:val="20"/>
+              </w:rPr>
+              <w:t xml:space="preserve">Цифровое благополучие, усталость от мессенджеров, осознанное использование технологий — наша тема в точку. Авторский, бесплатный заход.</w:t>
+            </w:r>
+          </w:p>
+        </w:tc>
+      </w:tr>
+      <w:tr>
+        <w:tc>
+          <w:tcPr>
+            <w:tcW w:type="dxa" w:w="2700"/>
+            <w:tcMar>
+              <w:top w:type="dxa" w:w="60"/>
+              <w:left w:type="dxa" w:w="90"/>
+              <w:bottom w:type="dxa" w:w="60"/>
+              <w:right w:type="dxa" w:w="90"/>
+            </w:tcMar>
+          </w:tcPr>
+          <w:p>
+            <w:pPr>
+              <w:spacing w:after="0"/>
+            </w:pPr>
+            <w:r>
+              <w:rPr>
+                <w:b w:val="false"/>
+                <w:bCs w:val="false"/>
+                <w:sz w:val="20"/>
+                <w:szCs w:val="20"/>
+              </w:rPr>
+              <w:t xml:space="preserve">Чистые Когниции (@pure_cognitions)</w:t>
+            </w:r>
+          </w:p>
+        </w:tc>
+        <w:tc>
+          <w:tcPr>
+            <w:tcW w:type="dxa" w:w="1100"/>
+            <w:tcMar>
+              <w:top w:type="dxa" w:w="60"/>
+              <w:left w:type="dxa" w:w="90"/>
+              <w:bottom w:type="dxa" w:w="60"/>
+              <w:right w:type="dxa" w:w="90"/>
+            </w:tcMar>
+          </w:tcPr>
+          <w:p>
+            <w:pPr>
+              <w:spacing w:after="0"/>
+            </w:pPr>
+            <w:r>
+              <w:rPr>
+                <w:b w:val="false"/>
+                <w:bCs w:val="false"/>
+                <w:sz w:val="20"/>
+                <w:szCs w:val="20"/>
+              </w:rPr>
+              <w:t xml:space="preserve">≈37.8k</w:t>
+            </w:r>
+          </w:p>
+        </w:tc>
+        <w:tc>
+          <w:tcPr>
+            <w:tcW w:type="dxa" w:w="1300"/>
+            <w:tcMar>
+              <w:top w:type="dxa" w:w="60"/>
+              <w:left w:type="dxa" w:w="90"/>
+              <w:bottom w:type="dxa" w:w="60"/>
+              <w:right w:type="dxa" w:w="90"/>
+            </w:tcMar>
+          </w:tcPr>
+          <w:p>
+            <w:pPr>
+              <w:spacing w:after="0"/>
+            </w:pPr>
+            <w:r>
+              <w:rPr>
+                <w:b w:val="false"/>
+                <w:bCs w:val="false"/>
+                <w:sz w:val="20"/>
+                <w:szCs w:val="20"/>
+              </w:rPr>
+              <w:t xml:space="preserve">средний-высокий</w:t>
+            </w:r>
+          </w:p>
+        </w:tc>
+        <w:tc>
+          <w:tcPr>
+            <w:tcW w:type="dxa" w:w="3900"/>
+            <w:tcMar>
+              <w:top w:type="dxa" w:w="60"/>
+              <w:left w:type="dxa" w:w="90"/>
+              <w:bottom w:type="dxa" w:w="60"/>
+              <w:right w:type="dxa" w:w="90"/>
+            </w:tcMar>
+          </w:tcPr>
+          <w:p>
+            <w:pPr>
+              <w:spacing w:after="0"/>
+            </w:pPr>
+            <w:r>
+              <w:rPr>
+                <w:b w:val="false"/>
+                <w:bCs w:val="false"/>
+                <w:sz w:val="20"/>
+                <w:szCs w:val="20"/>
+              </w:rPr>
+              <w:t xml:space="preserve">Психология, привычки, думскроллинг. «Рекламы нет» — заходить органикой / бартером / гостевым контентом, не платно.</w:t>
             </w:r>
           </w:p>
         </w:tc>

</xml_diff>

<commit_message>
docs/gtm: add @RuMiFit (wearable-companion channel) to channel list
</commit_message>
<xml_diff>
--- a/docs/GTM-stage2.docx
+++ b/docs/GTM-stage2.docx
@@ -1720,6 +1720,108 @@
                 <w:szCs w:val="20"/>
               </w:rPr>
               <w:t xml:space="preserve">Психология, привычки, думскроллинг. «Рекламы нет» — заходить органикой / бартером / гостевым контентом, не платно.</w:t>
+            </w:r>
+          </w:p>
+        </w:tc>
+      </w:tr>
+      <w:tr>
+        <w:tc>
+          <w:tcPr>
+            <w:tcW w:type="dxa" w:w="2700"/>
+            <w:tcMar>
+              <w:top w:type="dxa" w:w="60"/>
+              <w:left w:type="dxa" w:w="90"/>
+              <w:bottom w:type="dxa" w:w="60"/>
+              <w:right w:type="dxa" w:w="90"/>
+            </w:tcMar>
+          </w:tcPr>
+          <w:p>
+            <w:pPr>
+              <w:spacing w:after="0"/>
+            </w:pPr>
+            <w:r>
+              <w:rPr>
+                <w:b w:val="false"/>
+                <w:bCs w:val="false"/>
+                <w:sz w:val="20"/>
+                <w:szCs w:val="20"/>
+              </w:rPr>
+              <w:t xml:space="preserve">RuMiFit &amp; AeX mods (@RuMiFit)</w:t>
+            </w:r>
+          </w:p>
+        </w:tc>
+        <w:tc>
+          <w:tcPr>
+            <w:tcW w:type="dxa" w:w="1100"/>
+            <w:tcMar>
+              <w:top w:type="dxa" w:w="60"/>
+              <w:left w:type="dxa" w:w="90"/>
+              <w:bottom w:type="dxa" w:w="60"/>
+              <w:right w:type="dxa" w:w="90"/>
+            </w:tcMar>
+          </w:tcPr>
+          <w:p>
+            <w:pPr>
+              <w:spacing w:after="0"/>
+            </w:pPr>
+            <w:r>
+              <w:rPr>
+                <w:b w:val="false"/>
+                <w:bCs w:val="false"/>
+                <w:sz w:val="20"/>
+                <w:szCs w:val="20"/>
+              </w:rPr>
+              <w:t xml:space="preserve">≈4.1k</w:t>
+            </w:r>
+          </w:p>
+        </w:tc>
+        <w:tc>
+          <w:tcPr>
+            <w:tcW w:type="dxa" w:w="1300"/>
+            <w:tcMar>
+              <w:top w:type="dxa" w:w="60"/>
+              <w:left w:type="dxa" w:w="90"/>
+              <w:bottom w:type="dxa" w:w="60"/>
+              <w:right w:type="dxa" w:w="90"/>
+            </w:tcMar>
+          </w:tcPr>
+          <w:p>
+            <w:pPr>
+              <w:spacing w:after="0"/>
+            </w:pPr>
+            <w:r>
+              <w:rPr>
+                <w:b w:val="false"/>
+                <w:bCs w:val="false"/>
+                <w:sz w:val="20"/>
+                <w:szCs w:val="20"/>
+              </w:rPr>
+              <w:t xml:space="preserve">высокий</w:t>
+            </w:r>
+          </w:p>
+        </w:tc>
+        <w:tc>
+          <w:tcPr>
+            <w:tcW w:type="dxa" w:w="3900"/>
+            <w:tcMar>
+              <w:top w:type="dxa" w:w="60"/>
+              <w:left w:type="dxa" w:w="90"/>
+              <w:bottom w:type="dxa" w:w="60"/>
+              <w:right w:type="dxa" w:w="90"/>
+            </w:tcMar>
+          </w:tcPr>
+          <w:p>
+            <w:pPr>
+              <w:spacing w:after="0"/>
+            </w:pPr>
+            <w:r>
+              <w:rPr>
+                <w:b w:val="false"/>
+                <w:bCs w:val="false"/>
+                <w:sz w:val="20"/>
+                <w:szCs w:val="20"/>
+              </w:rPr>
+              <w:t xml:space="preserve">Моды companion-приложений Mi Band / Amazfit, русскоязычный. Аудитория — Android-владельцы браслетов, которые хотят больше от данных (ровно наш пул). Продуктовый канал — заход через партнёрство/упоминание.</w:t>
             </w:r>
           </w:p>
         </w:tc>

</xml_diff>

<commit_message>
docs/gtm: +10 fit Telegram channels, Stage-2 budget/channel note (Telegram-first)
</commit_message>
<xml_diff>
--- a/docs/GTM-stage2.docx
+++ b/docs/GTM-stage2.docx
@@ -1826,6 +1826,1026 @@
           </w:p>
         </w:tc>
       </w:tr>
+      <w:tr>
+        <w:tc>
+          <w:tcPr>
+            <w:tcW w:type="dxa" w:w="2700"/>
+            <w:tcMar>
+              <w:top w:type="dxa" w:w="60"/>
+              <w:left w:type="dxa" w:w="90"/>
+              <w:bottom w:type="dxa" w:w="60"/>
+              <w:right w:type="dxa" w:w="90"/>
+            </w:tcMar>
+          </w:tcPr>
+          <w:p>
+            <w:pPr>
+              <w:spacing w:after="0"/>
+            </w:pPr>
+            <w:r>
+              <w:rPr>
+                <w:b w:val="false"/>
+                <w:bCs w:val="false"/>
+                <w:sz w:val="20"/>
+                <w:szCs w:val="20"/>
+              </w:rPr>
+              <w:t xml:space="preserve">Человек Осознанный (@mindful_ru)</w:t>
+            </w:r>
+          </w:p>
+        </w:tc>
+        <w:tc>
+          <w:tcPr>
+            <w:tcW w:type="dxa" w:w="1100"/>
+            <w:tcMar>
+              <w:top w:type="dxa" w:w="60"/>
+              <w:left w:type="dxa" w:w="90"/>
+              <w:bottom w:type="dxa" w:w="60"/>
+              <w:right w:type="dxa" w:w="90"/>
+            </w:tcMar>
+          </w:tcPr>
+          <w:p>
+            <w:pPr>
+              <w:spacing w:after="0"/>
+            </w:pPr>
+            <w:r>
+              <w:rPr>
+                <w:b w:val="false"/>
+                <w:bCs w:val="false"/>
+                <w:sz w:val="20"/>
+                <w:szCs w:val="20"/>
+              </w:rPr>
+              <w:t xml:space="preserve">≈6k</w:t>
+            </w:r>
+          </w:p>
+        </w:tc>
+        <w:tc>
+          <w:tcPr>
+            <w:tcW w:type="dxa" w:w="1300"/>
+            <w:tcMar>
+              <w:top w:type="dxa" w:w="60"/>
+              <w:left w:type="dxa" w:w="90"/>
+              <w:bottom w:type="dxa" w:w="60"/>
+              <w:right w:type="dxa" w:w="90"/>
+            </w:tcMar>
+          </w:tcPr>
+          <w:p>
+            <w:pPr>
+              <w:spacing w:after="0"/>
+            </w:pPr>
+            <w:r>
+              <w:rPr>
+                <w:b w:val="false"/>
+                <w:bCs w:val="false"/>
+                <w:sz w:val="20"/>
+                <w:szCs w:val="20"/>
+              </w:rPr>
+              <w:t xml:space="preserve">высокий</w:t>
+            </w:r>
+          </w:p>
+        </w:tc>
+        <w:tc>
+          <w:tcPr>
+            <w:tcW w:type="dxa" w:w="3900"/>
+            <w:tcMar>
+              <w:top w:type="dxa" w:w="60"/>
+              <w:left w:type="dxa" w:w="90"/>
+              <w:bottom w:type="dxa" w:w="60"/>
+              <w:right w:type="dxa" w:w="90"/>
+            </w:tcMar>
+          </w:tcPr>
+          <w:p>
+            <w:pPr>
+              <w:spacing w:after="0"/>
+            </w:pPr>
+            <w:r>
+              <w:rPr>
+                <w:b w:val="false"/>
+                <w:bCs w:val="false"/>
+                <w:sz w:val="20"/>
+                <w:szCs w:val="20"/>
+              </w:rPr>
+              <w:t xml:space="preserve">Клинический психолог: внимание, стресс, сон и трекеры, «ортосомния», цифровая тревожность — наша тема и научный тон наблюдателя.</w:t>
+            </w:r>
+          </w:p>
+        </w:tc>
+      </w:tr>
+      <w:tr>
+        <w:tc>
+          <w:tcPr>
+            <w:tcW w:type="dxa" w:w="2700"/>
+            <w:tcMar>
+              <w:top w:type="dxa" w:w="60"/>
+              <w:left w:type="dxa" w:w="90"/>
+              <w:bottom w:type="dxa" w:w="60"/>
+              <w:right w:type="dxa" w:w="90"/>
+            </w:tcMar>
+          </w:tcPr>
+          <w:p>
+            <w:pPr>
+              <w:spacing w:after="0"/>
+            </w:pPr>
+            <w:r>
+              <w:rPr>
+                <w:b w:val="false"/>
+                <w:bCs w:val="false"/>
+                <w:sz w:val="20"/>
+                <w:szCs w:val="20"/>
+              </w:rPr>
+              <w:t xml:space="preserve">SW Приложения (@swapplication)</w:t>
+            </w:r>
+          </w:p>
+        </w:tc>
+        <w:tc>
+          <w:tcPr>
+            <w:tcW w:type="dxa" w:w="1100"/>
+            <w:tcMar>
+              <w:top w:type="dxa" w:w="60"/>
+              <w:left w:type="dxa" w:w="90"/>
+              <w:bottom w:type="dxa" w:w="60"/>
+              <w:right w:type="dxa" w:w="90"/>
+            </w:tcMar>
+          </w:tcPr>
+          <w:p>
+            <w:pPr>
+              <w:spacing w:after="0"/>
+            </w:pPr>
+            <w:r>
+              <w:rPr>
+                <w:b w:val="false"/>
+                <w:bCs w:val="false"/>
+                <w:sz w:val="20"/>
+                <w:szCs w:val="20"/>
+              </w:rPr>
+              <w:t xml:space="preserve">≈16.2k</w:t>
+            </w:r>
+          </w:p>
+        </w:tc>
+        <w:tc>
+          <w:tcPr>
+            <w:tcW w:type="dxa" w:w="1300"/>
+            <w:tcMar>
+              <w:top w:type="dxa" w:w="60"/>
+              <w:left w:type="dxa" w:w="90"/>
+              <w:bottom w:type="dxa" w:w="60"/>
+              <w:right w:type="dxa" w:w="90"/>
+            </w:tcMar>
+          </w:tcPr>
+          <w:p>
+            <w:pPr>
+              <w:spacing w:after="0"/>
+            </w:pPr>
+            <w:r>
+              <w:rPr>
+                <w:b w:val="false"/>
+                <w:bCs w:val="false"/>
+                <w:sz w:val="20"/>
+                <w:szCs w:val="20"/>
+              </w:rPr>
+              <w:t xml:space="preserve">высокий</w:t>
+            </w:r>
+          </w:p>
+        </w:tc>
+        <w:tc>
+          <w:tcPr>
+            <w:tcW w:type="dxa" w:w="3900"/>
+            <w:tcMar>
+              <w:top w:type="dxa" w:w="60"/>
+              <w:left w:type="dxa" w:w="90"/>
+              <w:bottom w:type="dxa" w:w="60"/>
+              <w:right w:type="dxa" w:w="90"/>
+            </w:tcMar>
+          </w:tcPr>
+          <w:p>
+            <w:pPr>
+              <w:spacing w:after="0"/>
+            </w:pPr>
+            <w:r>
+              <w:rPr>
+                <w:b w:val="false"/>
+                <w:bCs w:val="false"/>
+                <w:sz w:val="20"/>
+                <w:szCs w:val="20"/>
+              </w:rPr>
+              <w:t xml:space="preserve">Софт для умных часов (WearOS/Android) — аудитория владельцев смарт-часов, которым мало системных функций. Продаёт рекламные подборки.</w:t>
+            </w:r>
+          </w:p>
+        </w:tc>
+      </w:tr>
+      <w:tr>
+        <w:tc>
+          <w:tcPr>
+            <w:tcW w:type="dxa" w:w="2700"/>
+            <w:tcMar>
+              <w:top w:type="dxa" w:w="60"/>
+              <w:left w:type="dxa" w:w="90"/>
+              <w:bottom w:type="dxa" w:w="60"/>
+              <w:right w:type="dxa" w:w="90"/>
+            </w:tcMar>
+          </w:tcPr>
+          <w:p>
+            <w:pPr>
+              <w:spacing w:after="0"/>
+            </w:pPr>
+            <w:r>
+              <w:rPr>
+                <w:b w:val="false"/>
+                <w:bCs w:val="false"/>
+                <w:sz w:val="20"/>
+                <w:szCs w:val="20"/>
+              </w:rPr>
+              <w:t xml:space="preserve">Очень плохие обзоры (@verybadreview)</w:t>
+            </w:r>
+          </w:p>
+        </w:tc>
+        <w:tc>
+          <w:tcPr>
+            <w:tcW w:type="dxa" w:w="1100"/>
+            <w:tcMar>
+              <w:top w:type="dxa" w:w="60"/>
+              <w:left w:type="dxa" w:w="90"/>
+              <w:bottom w:type="dxa" w:w="60"/>
+              <w:right w:type="dxa" w:w="90"/>
+            </w:tcMar>
+          </w:tcPr>
+          <w:p>
+            <w:pPr>
+              <w:spacing w:after="0"/>
+            </w:pPr>
+            <w:r>
+              <w:rPr>
+                <w:b w:val="false"/>
+                <w:bCs w:val="false"/>
+                <w:sz w:val="20"/>
+                <w:szCs w:val="20"/>
+              </w:rPr>
+              <w:t xml:space="preserve">≈13.5k</w:t>
+            </w:r>
+          </w:p>
+        </w:tc>
+        <w:tc>
+          <w:tcPr>
+            <w:tcW w:type="dxa" w:w="1300"/>
+            <w:tcMar>
+              <w:top w:type="dxa" w:w="60"/>
+              <w:left w:type="dxa" w:w="90"/>
+              <w:bottom w:type="dxa" w:w="60"/>
+              <w:right w:type="dxa" w:w="90"/>
+            </w:tcMar>
+          </w:tcPr>
+          <w:p>
+            <w:pPr>
+              <w:spacing w:after="0"/>
+            </w:pPr>
+            <w:r>
+              <w:rPr>
+                <w:b w:val="false"/>
+                <w:bCs w:val="false"/>
+                <w:sz w:val="20"/>
+                <w:szCs w:val="20"/>
+              </w:rPr>
+              <w:t xml:space="preserve">хороший</w:t>
+            </w:r>
+          </w:p>
+        </w:tc>
+        <w:tc>
+          <w:tcPr>
+            <w:tcW w:type="dxa" w:w="3900"/>
+            <w:tcMar>
+              <w:top w:type="dxa" w:w="60"/>
+              <w:left w:type="dxa" w:w="90"/>
+              <w:bottom w:type="dxa" w:w="60"/>
+              <w:right w:type="dxa" w:w="90"/>
+            </w:tcMar>
+          </w:tcPr>
+          <w:p>
+            <w:pPr>
+              <w:spacing w:after="0"/>
+            </w:pPr>
+            <w:r>
+              <w:rPr>
+                <w:b w:val="false"/>
+                <w:bCs w:val="false"/>
+                <w:sz w:val="20"/>
+                <w:szCs w:val="20"/>
+              </w:rPr>
+              <w:t xml:space="preserve">Обзоры гаджетов и смарт-часов/трекеров (Amazfit, Huawei Watch) — Android-аудитория носимых.</w:t>
+            </w:r>
+          </w:p>
+        </w:tc>
+      </w:tr>
+      <w:tr>
+        <w:tc>
+          <w:tcPr>
+            <w:tcW w:type="dxa" w:w="2700"/>
+            <w:tcMar>
+              <w:top w:type="dxa" w:w="60"/>
+              <w:left w:type="dxa" w:w="90"/>
+              <w:bottom w:type="dxa" w:w="60"/>
+              <w:right w:type="dxa" w:w="90"/>
+            </w:tcMar>
+          </w:tcPr>
+          <w:p>
+            <w:pPr>
+              <w:spacing w:after="0"/>
+            </w:pPr>
+            <w:r>
+              <w:rPr>
+                <w:b w:val="false"/>
+                <w:bCs w:val="false"/>
+                <w:sz w:val="20"/>
+                <w:szCs w:val="20"/>
+              </w:rPr>
+              <w:t xml:space="preserve">CleverMind (@clevermindru_official)</w:t>
+            </w:r>
+          </w:p>
+        </w:tc>
+        <w:tc>
+          <w:tcPr>
+            <w:tcW w:type="dxa" w:w="1100"/>
+            <w:tcMar>
+              <w:top w:type="dxa" w:w="60"/>
+              <w:left w:type="dxa" w:w="90"/>
+              <w:bottom w:type="dxa" w:w="60"/>
+              <w:right w:type="dxa" w:w="90"/>
+            </w:tcMar>
+          </w:tcPr>
+          <w:p>
+            <w:pPr>
+              <w:spacing w:after="0"/>
+            </w:pPr>
+            <w:r>
+              <w:rPr>
+                <w:b w:val="false"/>
+                <w:bCs w:val="false"/>
+                <w:sz w:val="20"/>
+                <w:szCs w:val="20"/>
+              </w:rPr>
+              <w:t xml:space="preserve">≈28.8k</w:t>
+            </w:r>
+          </w:p>
+        </w:tc>
+        <w:tc>
+          <w:tcPr>
+            <w:tcW w:type="dxa" w:w="1300"/>
+            <w:tcMar>
+              <w:top w:type="dxa" w:w="60"/>
+              <w:left w:type="dxa" w:w="90"/>
+              <w:bottom w:type="dxa" w:w="60"/>
+              <w:right w:type="dxa" w:w="90"/>
+            </w:tcMar>
+          </w:tcPr>
+          <w:p>
+            <w:pPr>
+              <w:spacing w:after="0"/>
+            </w:pPr>
+            <w:r>
+              <w:rPr>
+                <w:b w:val="false"/>
+                <w:bCs w:val="false"/>
+                <w:sz w:val="20"/>
+                <w:szCs w:val="20"/>
+              </w:rPr>
+              <w:t xml:space="preserve">хороший</w:t>
+            </w:r>
+          </w:p>
+        </w:tc>
+        <w:tc>
+          <w:tcPr>
+            <w:tcW w:type="dxa" w:w="3900"/>
+            <w:tcMar>
+              <w:top w:type="dxa" w:w="60"/>
+              <w:left w:type="dxa" w:w="90"/>
+              <w:bottom w:type="dxa" w:w="60"/>
+              <w:right w:type="dxa" w:w="90"/>
+            </w:tcMar>
+          </w:tcPr>
+          <w:p>
+            <w:pPr>
+              <w:spacing w:after="0"/>
+            </w:pPr>
+            <w:r>
+              <w:rPr>
+                <w:b w:val="false"/>
+                <w:bCs w:val="false"/>
+                <w:sz w:val="20"/>
+                <w:szCs w:val="20"/>
+              </w:rPr>
+              <w:t xml:space="preserve">Ноотропы, биохакинг, мозг, усталость, самочувствие. Крупный, в целевом диапазоне.</w:t>
+            </w:r>
+          </w:p>
+        </w:tc>
+      </w:tr>
+      <w:tr>
+        <w:tc>
+          <w:tcPr>
+            <w:tcW w:type="dxa" w:w="2700"/>
+            <w:tcMar>
+              <w:top w:type="dxa" w:w="60"/>
+              <w:left w:type="dxa" w:w="90"/>
+              <w:bottom w:type="dxa" w:w="60"/>
+              <w:right w:type="dxa" w:w="90"/>
+            </w:tcMar>
+          </w:tcPr>
+          <w:p>
+            <w:pPr>
+              <w:spacing w:after="0"/>
+            </w:pPr>
+            <w:r>
+              <w:rPr>
+                <w:b w:val="false"/>
+                <w:bCs w:val="false"/>
+                <w:sz w:val="20"/>
+                <w:szCs w:val="20"/>
+              </w:rPr>
+              <w:t xml:space="preserve">Биохакинг (@hack_bio)</w:t>
+            </w:r>
+          </w:p>
+        </w:tc>
+        <w:tc>
+          <w:tcPr>
+            <w:tcW w:type="dxa" w:w="1100"/>
+            <w:tcMar>
+              <w:top w:type="dxa" w:w="60"/>
+              <w:left w:type="dxa" w:w="90"/>
+              <w:bottom w:type="dxa" w:w="60"/>
+              <w:right w:type="dxa" w:w="90"/>
+            </w:tcMar>
+          </w:tcPr>
+          <w:p>
+            <w:pPr>
+              <w:spacing w:after="0"/>
+            </w:pPr>
+            <w:r>
+              <w:rPr>
+                <w:b w:val="false"/>
+                <w:bCs w:val="false"/>
+                <w:sz w:val="20"/>
+                <w:szCs w:val="20"/>
+              </w:rPr>
+              <w:t xml:space="preserve">≈18.7k</w:t>
+            </w:r>
+          </w:p>
+        </w:tc>
+        <w:tc>
+          <w:tcPr>
+            <w:tcW w:type="dxa" w:w="1300"/>
+            <w:tcMar>
+              <w:top w:type="dxa" w:w="60"/>
+              <w:left w:type="dxa" w:w="90"/>
+              <w:bottom w:type="dxa" w:w="60"/>
+              <w:right w:type="dxa" w:w="90"/>
+            </w:tcMar>
+          </w:tcPr>
+          <w:p>
+            <w:pPr>
+              <w:spacing w:after="0"/>
+            </w:pPr>
+            <w:r>
+              <w:rPr>
+                <w:b w:val="false"/>
+                <w:bCs w:val="false"/>
+                <w:sz w:val="20"/>
+                <w:szCs w:val="20"/>
+              </w:rPr>
+              <w:t xml:space="preserve">средне-высокий</w:t>
+            </w:r>
+          </w:p>
+        </w:tc>
+        <w:tc>
+          <w:tcPr>
+            <w:tcW w:type="dxa" w:w="3900"/>
+            <w:tcMar>
+              <w:top w:type="dxa" w:w="60"/>
+              <w:left w:type="dxa" w:w="90"/>
+              <w:bottom w:type="dxa" w:w="60"/>
+              <w:right w:type="dxa" w:w="90"/>
+            </w:tcMar>
+          </w:tcPr>
+          <w:p>
+            <w:pPr>
+              <w:spacing w:after="0"/>
+            </w:pPr>
+            <w:r>
+              <w:rPr>
+                <w:b w:val="false"/>
+                <w:bCs w:val="false"/>
+                <w:sz w:val="20"/>
+                <w:szCs w:val="20"/>
+              </w:rPr>
+              <w:t xml:space="preserve">Биохакинг от проверенных экспертов (хроническая усталость и т.п.).</w:t>
+            </w:r>
+          </w:p>
+        </w:tc>
+      </w:tr>
+      <w:tr>
+        <w:tc>
+          <w:tcPr>
+            <w:tcW w:type="dxa" w:w="2700"/>
+            <w:tcMar>
+              <w:top w:type="dxa" w:w="60"/>
+              <w:left w:type="dxa" w:w="90"/>
+              <w:bottom w:type="dxa" w:w="60"/>
+              <w:right w:type="dxa" w:w="90"/>
+            </w:tcMar>
+          </w:tcPr>
+          <w:p>
+            <w:pPr>
+              <w:spacing w:after="0"/>
+            </w:pPr>
+            <w:r>
+              <w:rPr>
+                <w:b w:val="false"/>
+                <w:bCs w:val="false"/>
+                <w:sz w:val="20"/>
+                <w:szCs w:val="20"/>
+              </w:rPr>
+              <w:t xml:space="preserve">Доктор Галеева (@doctor_galeeva)</w:t>
+            </w:r>
+          </w:p>
+        </w:tc>
+        <w:tc>
+          <w:tcPr>
+            <w:tcW w:type="dxa" w:w="1100"/>
+            <w:tcMar>
+              <w:top w:type="dxa" w:w="60"/>
+              <w:left w:type="dxa" w:w="90"/>
+              <w:bottom w:type="dxa" w:w="60"/>
+              <w:right w:type="dxa" w:w="90"/>
+            </w:tcMar>
+          </w:tcPr>
+          <w:p>
+            <w:pPr>
+              <w:spacing w:after="0"/>
+            </w:pPr>
+            <w:r>
+              <w:rPr>
+                <w:b w:val="false"/>
+                <w:bCs w:val="false"/>
+                <w:sz w:val="20"/>
+                <w:szCs w:val="20"/>
+              </w:rPr>
+              <w:t xml:space="preserve">≈28.8k</w:t>
+            </w:r>
+          </w:p>
+        </w:tc>
+        <w:tc>
+          <w:tcPr>
+            <w:tcW w:type="dxa" w:w="1300"/>
+            <w:tcMar>
+              <w:top w:type="dxa" w:w="60"/>
+              <w:left w:type="dxa" w:w="90"/>
+              <w:bottom w:type="dxa" w:w="60"/>
+              <w:right w:type="dxa" w:w="90"/>
+            </w:tcMar>
+          </w:tcPr>
+          <w:p>
+            <w:pPr>
+              <w:spacing w:after="0"/>
+            </w:pPr>
+            <w:r>
+              <w:rPr>
+                <w:b w:val="false"/>
+                <w:bCs w:val="false"/>
+                <w:sz w:val="20"/>
+                <w:szCs w:val="20"/>
+              </w:rPr>
+              <w:t xml:space="preserve">средний</w:t>
+            </w:r>
+          </w:p>
+        </w:tc>
+        <w:tc>
+          <w:tcPr>
+            <w:tcW w:type="dxa" w:w="3900"/>
+            <w:tcMar>
+              <w:top w:type="dxa" w:w="60"/>
+              <w:left w:type="dxa" w:w="90"/>
+              <w:bottom w:type="dxa" w:w="60"/>
+              <w:right w:type="dxa" w:w="90"/>
+            </w:tcMar>
+          </w:tcPr>
+          <w:p>
+            <w:pPr>
+              <w:spacing w:after="0"/>
+            </w:pPr>
+            <w:r>
+              <w:rPr>
+                <w:b w:val="false"/>
+                <w:bCs w:val="false"/>
+                <w:sz w:val="20"/>
+                <w:szCs w:val="20"/>
+              </w:rPr>
+              <w:t xml:space="preserve">Невролог-сомнолог, много про сон (длительность, хронотип). Клинический + спонсорские посты.</w:t>
+            </w:r>
+          </w:p>
+        </w:tc>
+      </w:tr>
+      <w:tr>
+        <w:tc>
+          <w:tcPr>
+            <w:tcW w:type="dxa" w:w="2700"/>
+            <w:tcMar>
+              <w:top w:type="dxa" w:w="60"/>
+              <w:left w:type="dxa" w:w="90"/>
+              <w:bottom w:type="dxa" w:w="60"/>
+              <w:right w:type="dxa" w:w="90"/>
+            </w:tcMar>
+          </w:tcPr>
+          <w:p>
+            <w:pPr>
+              <w:spacing w:after="0"/>
+            </w:pPr>
+            <w:r>
+              <w:rPr>
+                <w:b w:val="false"/>
+                <w:bCs w:val="false"/>
+                <w:sz w:val="20"/>
+                <w:szCs w:val="20"/>
+              </w:rPr>
+              <w:t xml:space="preserve">Сомнолог Бузунов (@SomnologBuzunov)</w:t>
+            </w:r>
+          </w:p>
+        </w:tc>
+        <w:tc>
+          <w:tcPr>
+            <w:tcW w:type="dxa" w:w="1100"/>
+            <w:tcMar>
+              <w:top w:type="dxa" w:w="60"/>
+              <w:left w:type="dxa" w:w="90"/>
+              <w:bottom w:type="dxa" w:w="60"/>
+              <w:right w:type="dxa" w:w="90"/>
+            </w:tcMar>
+          </w:tcPr>
+          <w:p>
+            <w:pPr>
+              <w:spacing w:after="0"/>
+            </w:pPr>
+            <w:r>
+              <w:rPr>
+                <w:b w:val="false"/>
+                <w:bCs w:val="false"/>
+                <w:sz w:val="20"/>
+                <w:szCs w:val="20"/>
+              </w:rPr>
+              <w:t xml:space="preserve">≈7.8k</w:t>
+            </w:r>
+          </w:p>
+        </w:tc>
+        <w:tc>
+          <w:tcPr>
+            <w:tcW w:type="dxa" w:w="1300"/>
+            <w:tcMar>
+              <w:top w:type="dxa" w:w="60"/>
+              <w:left w:type="dxa" w:w="90"/>
+              <w:bottom w:type="dxa" w:w="60"/>
+              <w:right w:type="dxa" w:w="90"/>
+            </w:tcMar>
+          </w:tcPr>
+          <w:p>
+            <w:pPr>
+              <w:spacing w:after="0"/>
+            </w:pPr>
+            <w:r>
+              <w:rPr>
+                <w:b w:val="false"/>
+                <w:bCs w:val="false"/>
+                <w:sz w:val="20"/>
+                <w:szCs w:val="20"/>
+              </w:rPr>
+              <w:t xml:space="preserve">средний</w:t>
+            </w:r>
+          </w:p>
+        </w:tc>
+        <w:tc>
+          <w:tcPr>
+            <w:tcW w:type="dxa" w:w="3900"/>
+            <w:tcMar>
+              <w:top w:type="dxa" w:w="60"/>
+              <w:left w:type="dxa" w:w="90"/>
+              <w:bottom w:type="dxa" w:w="60"/>
+              <w:right w:type="dxa" w:w="90"/>
+            </w:tcMar>
+          </w:tcPr>
+          <w:p>
+            <w:pPr>
+              <w:spacing w:after="0"/>
+            </w:pPr>
+            <w:r>
+              <w:rPr>
+                <w:b w:val="false"/>
+                <w:bCs w:val="false"/>
+                <w:sz w:val="20"/>
+                <w:szCs w:val="20"/>
+              </w:rPr>
+              <w:t xml:space="preserve">Научный сомнолог: сон, стресс, выгорание, бессонница. Много промо лекций/курсов.</w:t>
+            </w:r>
+          </w:p>
+        </w:tc>
+      </w:tr>
+      <w:tr>
+        <w:tc>
+          <w:tcPr>
+            <w:tcW w:type="dxa" w:w="2700"/>
+            <w:tcMar>
+              <w:top w:type="dxa" w:w="60"/>
+              <w:left w:type="dxa" w:w="90"/>
+              <w:bottom w:type="dxa" w:w="60"/>
+              <w:right w:type="dxa" w:w="90"/>
+            </w:tcMar>
+          </w:tcPr>
+          <w:p>
+            <w:pPr>
+              <w:spacing w:after="0"/>
+            </w:pPr>
+            <w:r>
+              <w:rPr>
+                <w:b w:val="false"/>
+                <w:bCs w:val="false"/>
+                <w:sz w:val="20"/>
+                <w:szCs w:val="20"/>
+              </w:rPr>
+              <w:t xml:space="preserve">Настигло (@travkinatxt)</w:t>
+            </w:r>
+          </w:p>
+        </w:tc>
+        <w:tc>
+          <w:tcPr>
+            <w:tcW w:type="dxa" w:w="1100"/>
+            <w:tcMar>
+              <w:top w:type="dxa" w:w="60"/>
+              <w:left w:type="dxa" w:w="90"/>
+              <w:bottom w:type="dxa" w:w="60"/>
+              <w:right w:type="dxa" w:w="90"/>
+            </w:tcMar>
+          </w:tcPr>
+          <w:p>
+            <w:pPr>
+              <w:spacing w:after="0"/>
+            </w:pPr>
+            <w:r>
+              <w:rPr>
+                <w:b w:val="false"/>
+                <w:bCs w:val="false"/>
+                <w:sz w:val="20"/>
+                <w:szCs w:val="20"/>
+              </w:rPr>
+              <w:t xml:space="preserve">≈6.9k</w:t>
+            </w:r>
+          </w:p>
+        </w:tc>
+        <w:tc>
+          <w:tcPr>
+            <w:tcW w:type="dxa" w:w="1300"/>
+            <w:tcMar>
+              <w:top w:type="dxa" w:w="60"/>
+              <w:left w:type="dxa" w:w="90"/>
+              <w:bottom w:type="dxa" w:w="60"/>
+              <w:right w:type="dxa" w:w="90"/>
+            </w:tcMar>
+          </w:tcPr>
+          <w:p>
+            <w:pPr>
+              <w:spacing w:after="0"/>
+            </w:pPr>
+            <w:r>
+              <w:rPr>
+                <w:b w:val="false"/>
+                <w:bCs w:val="false"/>
+                <w:sz w:val="20"/>
+                <w:szCs w:val="20"/>
+              </w:rPr>
+              <w:t xml:space="preserve">средний</w:t>
+            </w:r>
+          </w:p>
+        </w:tc>
+        <w:tc>
+          <w:tcPr>
+            <w:tcW w:type="dxa" w:w="3900"/>
+            <w:tcMar>
+              <w:top w:type="dxa" w:w="60"/>
+              <w:left w:type="dxa" w:w="90"/>
+              <w:bottom w:type="dxa" w:w="60"/>
+              <w:right w:type="dxa" w:w="90"/>
+            </w:tcMar>
+          </w:tcPr>
+          <w:p>
+            <w:pPr>
+              <w:spacing w:after="0"/>
+            </w:pPr>
+            <w:r>
+              <w:rPr>
+                <w:b w:val="false"/>
+                <w:bCs w:val="false"/>
+                <w:sz w:val="20"/>
+                <w:szCs w:val="20"/>
+              </w:rPr>
+              <w:t xml:space="preserve">Нейронаука/мозг (автор книги Homo Mutabilis), но много личных эссе и «рекламу не шлите» — только органика/контент.</w:t>
+            </w:r>
+          </w:p>
+        </w:tc>
+      </w:tr>
+      <w:tr>
+        <w:tc>
+          <w:tcPr>
+            <w:tcW w:type="dxa" w:w="2700"/>
+            <w:tcMar>
+              <w:top w:type="dxa" w:w="60"/>
+              <w:left w:type="dxa" w:w="90"/>
+              <w:bottom w:type="dxa" w:w="60"/>
+              <w:right w:type="dxa" w:w="90"/>
+            </w:tcMar>
+          </w:tcPr>
+          <w:p>
+            <w:pPr>
+              <w:spacing w:after="0"/>
+            </w:pPr>
+            <w:r>
+              <w:rPr>
+                <w:b w:val="false"/>
+                <w:bCs w:val="false"/>
+                <w:sz w:val="20"/>
+                <w:szCs w:val="20"/>
+              </w:rPr>
+              <w:t xml:space="preserve">Школа Осознанности (@mindfulneschool)</w:t>
+            </w:r>
+          </w:p>
+        </w:tc>
+        <w:tc>
+          <w:tcPr>
+            <w:tcW w:type="dxa" w:w="1100"/>
+            <w:tcMar>
+              <w:top w:type="dxa" w:w="60"/>
+              <w:left w:type="dxa" w:w="90"/>
+              <w:bottom w:type="dxa" w:w="60"/>
+              <w:right w:type="dxa" w:w="90"/>
+            </w:tcMar>
+          </w:tcPr>
+          <w:p>
+            <w:pPr>
+              <w:spacing w:after="0"/>
+            </w:pPr>
+            <w:r>
+              <w:rPr>
+                <w:b w:val="false"/>
+                <w:bCs w:val="false"/>
+                <w:sz w:val="20"/>
+                <w:szCs w:val="20"/>
+              </w:rPr>
+              <w:t xml:space="preserve">≈4.8k</w:t>
+            </w:r>
+          </w:p>
+        </w:tc>
+        <w:tc>
+          <w:tcPr>
+            <w:tcW w:type="dxa" w:w="1300"/>
+            <w:tcMar>
+              <w:top w:type="dxa" w:w="60"/>
+              <w:left w:type="dxa" w:w="90"/>
+              <w:bottom w:type="dxa" w:w="60"/>
+              <w:right w:type="dxa" w:w="90"/>
+            </w:tcMar>
+          </w:tcPr>
+          <w:p>
+            <w:pPr>
+              <w:spacing w:after="0"/>
+            </w:pPr>
+            <w:r>
+              <w:rPr>
+                <w:b w:val="false"/>
+                <w:bCs w:val="false"/>
+                <w:sz w:val="20"/>
+                <w:szCs w:val="20"/>
+              </w:rPr>
+              <w:t xml:space="preserve">средне-низкий</w:t>
+            </w:r>
+          </w:p>
+        </w:tc>
+        <w:tc>
+          <w:tcPr>
+            <w:tcW w:type="dxa" w:w="3900"/>
+            <w:tcMar>
+              <w:top w:type="dxa" w:w="60"/>
+              <w:left w:type="dxa" w:w="90"/>
+              <w:bottom w:type="dxa" w:w="60"/>
+              <w:right w:type="dxa" w:w="90"/>
+            </w:tcMar>
+          </w:tcPr>
+          <w:p>
+            <w:pPr>
+              <w:spacing w:after="0"/>
+            </w:pPr>
+            <w:r>
+              <w:rPr>
+                <w:b w:val="false"/>
+                <w:bCs w:val="false"/>
+                <w:sz w:val="20"/>
+                <w:szCs w:val="20"/>
+              </w:rPr>
+              <w:t xml:space="preserve">Осознанность/медитация, больше философско-духовный тон + продажа курсов.</w:t>
+            </w:r>
+          </w:p>
+        </w:tc>
+      </w:tr>
+      <w:tr>
+        <w:tc>
+          <w:tcPr>
+            <w:tcW w:type="dxa" w:w="2700"/>
+            <w:tcMar>
+              <w:top w:type="dxa" w:w="60"/>
+              <w:left w:type="dxa" w:w="90"/>
+              <w:bottom w:type="dxa" w:w="60"/>
+              <w:right w:type="dxa" w:w="90"/>
+            </w:tcMar>
+          </w:tcPr>
+          <w:p>
+            <w:pPr>
+              <w:spacing w:after="0"/>
+            </w:pPr>
+            <w:r>
+              <w:rPr>
+                <w:b w:val="false"/>
+                <w:bCs w:val="false"/>
+                <w:sz w:val="20"/>
+                <w:szCs w:val="20"/>
+              </w:rPr>
+              <w:t xml:space="preserve">Про Часы (@prochasyblog)</w:t>
+            </w:r>
+          </w:p>
+        </w:tc>
+        <w:tc>
+          <w:tcPr>
+            <w:tcW w:type="dxa" w:w="1100"/>
+            <w:tcMar>
+              <w:top w:type="dxa" w:w="60"/>
+              <w:left w:type="dxa" w:w="90"/>
+              <w:bottom w:type="dxa" w:w="60"/>
+              <w:right w:type="dxa" w:w="90"/>
+            </w:tcMar>
+          </w:tcPr>
+          <w:p>
+            <w:pPr>
+              <w:spacing w:after="0"/>
+            </w:pPr>
+            <w:r>
+              <w:rPr>
+                <w:b w:val="false"/>
+                <w:bCs w:val="false"/>
+                <w:sz w:val="20"/>
+                <w:szCs w:val="20"/>
+              </w:rPr>
+              <w:t xml:space="preserve">≈8.8k</w:t>
+            </w:r>
+          </w:p>
+        </w:tc>
+        <w:tc>
+          <w:tcPr>
+            <w:tcW w:type="dxa" w:w="1300"/>
+            <w:tcMar>
+              <w:top w:type="dxa" w:w="60"/>
+              <w:left w:type="dxa" w:w="90"/>
+              <w:bottom w:type="dxa" w:w="60"/>
+              <w:right w:type="dxa" w:w="90"/>
+            </w:tcMar>
+          </w:tcPr>
+          <w:p>
+            <w:pPr>
+              <w:spacing w:after="0"/>
+            </w:pPr>
+            <w:r>
+              <w:rPr>
+                <w:b w:val="false"/>
+                <w:bCs w:val="false"/>
+                <w:sz w:val="20"/>
+                <w:szCs w:val="20"/>
+              </w:rPr>
+              <w:t xml:space="preserve">средне-низкий</w:t>
+            </w:r>
+          </w:p>
+        </w:tc>
+        <w:tc>
+          <w:tcPr>
+            <w:tcW w:type="dxa" w:w="3900"/>
+            <w:tcMar>
+              <w:top w:type="dxa" w:w="60"/>
+              <w:left w:type="dxa" w:w="90"/>
+              <w:bottom w:type="dxa" w:w="60"/>
+              <w:right w:type="dxa" w:w="90"/>
+            </w:tcMar>
+          </w:tcPr>
+          <w:p>
+            <w:pPr>
+              <w:spacing w:after="0"/>
+            </w:pPr>
+            <w:r>
+              <w:rPr>
+                <w:b w:val="false"/>
+                <w:bCs w:val="false"/>
+                <w:sz w:val="20"/>
+                <w:szCs w:val="20"/>
+              </w:rPr>
+              <w:t xml:space="preserve">Обзоры часов — больше классика, иногда браслеты. Запасной вариант по носимым.</w:t>
+            </w:r>
+          </w:p>
+        </w:tc>
+      </w:tr>
     </w:tbl>
     <w:p>
       <w:pPr>
@@ -2083,6 +3103,23 @@
           <w:szCs w:val="22"/>
         </w:rPr>
         <w:t xml:space="preserve">Стадия 2 (с бюджетом): лить в те же fit-пулы + lookalike + микро-инфлюенсеры, никакого слепого широкого охвата. Оружие ранжирования — сильный ретеншн (D7 76% на тёплых) + глубина вовлечённости (Calls/DAU).</w:t>
+      </w:r>
+    </w:p>
+    <w:p>
+      <w:pPr>
+        <w:pStyle w:val="ListParagraph"/>
+        <w:numPr>
+          <w:ilvl w:val="0"/>
+          <w:numId w:val="2"/>
+        </w:numPr>
+        <w:spacing w:after="60"/>
+      </w:pPr>
+      <w:r>
+        <w:rPr>
+          <w:sz w:val="22"/>
+          <w:szCs w:val="22"/>
+        </w:rPr>
+        <w:t xml:space="preserve">Бюджет Стадии 2 — траншами (первый ≈300k, транши идут последовательно). Основной канал — Telegram: платные интеграции в нишевых каналах из списка выше. Добор/альтернативы — Яндекс.Директ и РСЯ (веб) и реклама приложений в Яндексе. Каждый канал под правило D7 ≥ 40%: бюджет перетекает к тем, кто держит удержание.</w:t>
       </w:r>
     </w:p>
     <w:p>

</xml_diff>